<commit_message>
Diagramas: UD 4 (Semaphore, Condition, productor-consumidor), UD 7 y UD 8 (40 en total)
- semaphore-aforo: el aforo del Semaphore(3) con acquire/release
- condition-wait-notify y productor-consumidor: wait/notify bajo el mismo
  lock y la cola compartida paso a paso
- codigos-estado: las cuatro familias 2xx/3xx/4xx/5xx
- dotenv-flujo: .env → load_dotenv() → os.environ → código, sin subir claves
- Inventario y DOCX regenerados (43 PNG intermedios, gitignored)
</commit_message>
<xml_diff>
--- a/docx_out/UD 3 - Hilos y concurrencia/UD 3 - Apuntes.docx
+++ b/docx_out/UD 3 - Hilos y concurrencia/UD 3 - Apuntes.docx
@@ -15361,143 +15361,6 @@
       </w:pPr>
       <w:r>
         <w:t xml:space="preserve">Diagrama de transiciones de estados de un hilo: NUEVO, EJECUTABLE, EJECUCIÓN, BLOQUEADO y TERMINADO, con start(), yield() y las esperas de sleep() o lock</w:t>
-      </w:r>
-    </w:p>
-    <w:p>
-      <w:pPr>
-        <w:pStyle w:val="SourceCode"/>
-      </w:pPr>
-      <w:r>
-        <w:rPr>
-          <w:rStyle w:val="VerbatimChar"/>
-        </w:rPr>
-        <w:t xml:space="preserve">  ┌──────────────┐</w:t>
-      </w:r>
-      <w:r>
-        <w:br/>
-      </w:r>
-      <w:r>
-        <w:rPr>
-          <w:rStyle w:val="VerbatimChar"/>
-        </w:rPr>
-        <w:t xml:space="preserve">  │    NUEVO     │  ← Thread creado, no start()</w:t>
-      </w:r>
-      <w:r>
-        <w:br/>
-      </w:r>
-      <w:r>
-        <w:rPr>
-          <w:rStyle w:val="VerbatimChar"/>
-        </w:rPr>
-        <w:t xml:space="preserve">  └──────┬───────┘</w:t>
-      </w:r>
-      <w:r>
-        <w:br/>
-      </w:r>
-      <w:r>
-        <w:rPr>
-          <w:rStyle w:val="VerbatimChar"/>
-        </w:rPr>
-        <w:t xml:space="preserve">         ↓ start()</w:t>
-      </w:r>
-      <w:r>
-        <w:br/>
-      </w:r>
-      <w:r>
-        <w:rPr>
-          <w:rStyle w:val="VerbatimChar"/>
-        </w:rPr>
-        <w:t xml:space="preserve">  ┌──────────────┐</w:t>
-      </w:r>
-      <w:r>
-        <w:br/>
-      </w:r>
-      <w:r>
-        <w:rPr>
-          <w:rStyle w:val="VerbatimChar"/>
-        </w:rPr>
-        <w:t xml:space="preserve">  │  EJECUTABLE  │  ← Puede ejecutar cuando el scheduler quiera</w:t>
-      </w:r>
-      <w:r>
-        <w:br/>
-      </w:r>
-      <w:r>
-        <w:rPr>
-          <w:rStyle w:val="VerbatimChar"/>
-        </w:rPr>
-        <w:t xml:space="preserve">  └──────┬───────┘</w:t>
-      </w:r>
-      <w:r>
-        <w:br/>
-      </w:r>
-      <w:r>
-        <w:rPr>
-          <w:rStyle w:val="VerbatimChar"/>
-        </w:rPr>
-        <w:t xml:space="preserve">         ↓</w:t>
-      </w:r>
-      <w:r>
-        <w:br/>
-      </w:r>
-      <w:r>
-        <w:rPr>
-          <w:rStyle w:val="VerbatimChar"/>
-        </w:rPr>
-        <w:t xml:space="preserve">  ┌──────────────┐     ┌──────────────┐</w:t>
-      </w:r>
-      <w:r>
-        <w:br/>
-      </w:r>
-      <w:r>
-        <w:rPr>
-          <w:rStyle w:val="VerbatimChar"/>
-        </w:rPr>
-        <w:t xml:space="preserve">  │  EJECUCIÓN   │←───→│  BLOQUEADO   │</w:t>
-      </w:r>
-      <w:r>
-        <w:br/>
-      </w:r>
-      <w:r>
-        <w:rPr>
-          <w:rStyle w:val="VerbatimChar"/>
-        </w:rPr>
-        <w:t xml:space="preserve">  └──────┬───────┘     └──────────────┘</w:t>
-      </w:r>
-      <w:r>
-        <w:br/>
-      </w:r>
-      <w:r>
-        <w:rPr>
-          <w:rStyle w:val="VerbatimChar"/>
-        </w:rPr>
-        <w:t xml:space="preserve">         ↓               (sleep, I/O, lock)</w:t>
-      </w:r>
-      <w:r>
-        <w:br/>
-      </w:r>
-      <w:r>
-        <w:rPr>
-          <w:rStyle w:val="VerbatimChar"/>
-        </w:rPr>
-        <w:t xml:space="preserve">  ┌──────────────┐</w:t>
-      </w:r>
-      <w:r>
-        <w:br/>
-      </w:r>
-      <w:r>
-        <w:rPr>
-          <w:rStyle w:val="VerbatimChar"/>
-        </w:rPr>
-        <w:t xml:space="preserve">  │  TERMINADO   │  ← run() terminó</w:t>
-      </w:r>
-      <w:r>
-        <w:br/>
-      </w:r>
-      <w:r>
-        <w:rPr>
-          <w:rStyle w:val="VerbatimChar"/>
-        </w:rPr>
-        <w:t xml:space="preserve">  └──────────────┘</w:t>
       </w:r>
     </w:p>
     <w:p>

</xml_diff>